<commit_message>
04.1: remove duplicate T076 trace; 04.2 codebook revision 1.2; 04.3: rebuild convergent-set flags from 03.2
</commit_message>
<xml_diff>
--- a/materials/04_rg_intervention_framework/asb_framework_04_2_rg_intervention_framework_codebook.docx
+++ b/materials/04_rg_intervention_framework/asb_framework_04_2_rg_intervention_framework_codebook.docx
@@ -459,7 +459,7 @@
           <w:sz w:val="24"/>
           <w:szCs w:val="24"/>
         </w:rPr>
-        <w:t>Counts and statistics are not included in this codebook. The codebook documents structure, vocabularies, and decision rules; quantitative summaries (record counts, distributions, cross-tabulations) appear in the main paper.</w:t>
+        <w:t>Summary counts in sections 3.12 and 6 are computed from the Framework file (04.1), which is the source of record for every value. The codebook documents structure, vocabularies, and decision rules; quantitative summaries (record counts, distributions, cross-tabulations) appear in the main paper.</w:t>
       </w:r>
     </w:p>
     <w:p>
@@ -529,7 +529,7 @@
           <w:sz w:val="24"/>
           <w:szCs w:val="24"/>
         </w:rPr>
-        <w:t>The numbering reflects the order in which tools were added during the consolidation work, not their conceptual rank. Tools T001 through T174 represent the consolidated empirical and theoretical evidence base. Tools T175 through T210 were added in a final extrapolation pass to fill identified architectural gaps; most carry Evidence Status = Extrapolated, although a small number (T200, T207) gained empirical support during the trace audit and now carry Evidence Status = Empirically tested while remaining in the extrapolated numbering block by ID position.</w:t>
+        <w:t>The numbering reflects the order in which tools were added during the consolidation work, not their conceptual rank. Tools T001 through T174 represent the consolidated empirical and theoretical evidence base. Tools T175 through T210 were added in a final pass as newly designed tools where Stage 1 structural patterns identified a specific intervention gap (design rationale in the Notes column); most carry Evidence Status = Extrapolated. Two (T200, T207) were later linked to Stage 1 records during the trace audit and now carry Evidence Status = Empirically tested; they keep their place in the domain, which records how they entered the Framework.</w:t>
       </w:r>
     </w:p>
     <w:p>
@@ -1728,7 +1728,7 @@
                 <w:sz w:val="20"/>
                 <w:szCs w:val="20"/>
               </w:rPr>
-              <w:t>Domain is determined by the tool’s primary mechanism, not by its evidence status. Tools T200 and T207 sit in the Extrapolated and Novel Tools domain block by ID position but carry Evidence Status = Empirically tested; the domain label reflects the tool’s structural position in the Framework, not its current evidence base.</w:t>
+              <w:t>For the fourteen mechanism-defined domains, Domain is determined by the tool’s primary mechanism, not by its evidence status. Because domain follows primary mechanism, a tool’s framework domain can differ from the Stage 1 domain of its tool code; for example, T041 and T042 carry STRUCT-DISPLAY but sit in Time and Session Management because their mechanism is session-time salience. The Extrapolated and Novel Tools domain (the manuscript’s Newly Designed Tools domain) records how a tool entered the Framework rather than a distinct mechanism: it holds every tool generated through Stage 1 synthesis rather than consolidated from Stage 1 records. Tools T200 and T207 were placed there as newly designed tools and were later linked to Stage 1 records on re-audit of the Taxonomy Source column (T200: EXP_2024_Hollingshead_LIMIT-DEP; T207: EXP_2018_Harris_MSG-POP_EMO, EXP_2022_MuttiPacker_MSG-POP_HS, EXP_2022_MuttiPacker_MSG-POP_LS). They therefore carry Evidence Status = Empirically tested while keeping their domain, which reflects their provenance. The domain holds 36 tools, 34 with Evidence Status = Extrapolated.</w:t>
             </w:r>
           </w:p>
         </w:tc>
@@ -2589,7 +2589,7 @@
                 <w:sz w:val="20"/>
                 <w:szCs w:val="20"/>
               </w:rPr>
-              <w:t>Coded by convergence of three criteria: (1) the mechanism’s design intent; (2) the friction profile (how restrictive the tool is); (3) the evidence base (which population the tool was tested on or designed for). Where these three criteria converge, code by their consensus. Where they diverge, code by the most restrictive population. For example, a tool whose mechanism implies universal applicability but whose evidence base tested only high-risk gamblers is coded as High-risk.</w:t>
+              <w:t>Coded by convergence of three criteria: (1) the mechanism’s design intent; (2) the friction profile (the degree to which the tool constrains player choice or behaviour); (3) the Tool Target Level of the linked Stage 1 records (the Tool_Target_Tier value of each record listed in Taxonomy Source, which records the population the tool was designed for, not the sample it was evaluated in; see 02.2). Where the three criteria agree, code by their consensus. Where they differ, code by the most restrictive applicable risk tier. Stage 1 LOW values are coded Universal where the mechanism and friction profile do not restrict use to a risk-defined population. Sample severity (the Study_Sample field) plays no part in this coding. For example, T033 (mandatory session break after 20 minutes of continuous play) is designed for all players, imposes the same friction on all players, and both of its linked records carry Tool_Target_Tier LOW, so it is coded Universal even though the studies recruited student samples; T046 (extended time-out, 6 to 12 months) is designed for gamblers with established risk, is highly restrictive, and eight of its nine linked records carry HIGH (the ninth has no human sample), so it is coded High-risk.</w:t>
             </w:r>
           </w:p>
         </w:tc>
@@ -2634,7 +2634,7 @@
           <w:sz w:val="24"/>
           <w:szCs w:val="24"/>
         </w:rPr>
-        <w:t>The Target Population vocabulary is a Stage 2 elaboration of the Stage 1 record-level Tool_Target_Tier values (ALL, HIGH, MOD, LOW, N/A; see 02.1 Field Inventory and 02.2 Extraction Codebook). The Stage 2 vocabulary preserves the four risk-tier values (Universal, Moderate-risk, Moderate-High-risk, High-risk) and adds three further targeting categories (Young adults, New accounts, Research/system development) to capture targeting concepts that emerge at the framework-entry level but were not coded at the record level.</w:t>
+        <w:t>The Target Population vocabulary is a Stage 2 elaboration of the Stage 1 record-level Tool_Target_Tier values (ALL, HIGH, MOD, LOW, N/A; see 02.1 Field Inventory and 02.2 Extraction Codebook). ALL maps to Universal, MOD to Moderate-risk and HIGH to High-risk. LOW maps to Universal under the rule above, because a tool designed for low-risk gamblers that does not restrict use to a risk-defined population is available to all. Moderate-High-risk was introduced at Stage 2 for tools targeting the upper-moderate to lower-high-risk boundary, typically operator outreach. Three further categories (Young adults, New accounts, Research/system development) capture targeting concepts that emerge at framework level but were not coded at record level.</w:t>
       </w:r>
     </w:p>
     <w:p>
@@ -3708,11 +3708,311 @@
     <w:p>
       <w:pPr>
         <w:pStyle w:val="Normal"/>
-        <w:spacing w:lineRule="auto" w:line="240" w:before="0" w:after="0"/>
-        <w:rPr/>
-      </w:pPr>
-      <w:r>
-        <w:rPr/>
+        <w:spacing w:lineRule="auto" w:line="240" w:before="160" w:after="100"/>
+        <w:jc w:val="start"/>
+        <w:rPr/>
+      </w:pPr>
+      <w:r>
+        <w:rPr>
+          <w:rFonts w:eastAsia="Times New Roman" w:cs="Times New Roman"/>
+          <w:b/>
+          <w:bCs/>
+          <w:i/>
+          <w:iCs/>
+          <w:sz w:val="24"/>
+          <w:szCs w:val="24"/>
+        </w:rPr>
+        <w:t>Control value definitions</w:t>
+      </w:r>
+    </w:p>
+    <w:p>
+      <w:pPr>
+        <w:pStyle w:val="Normal"/>
+        <w:spacing w:lineRule="auto" w:line="240" w:before="0" w:after="120"/>
+        <w:jc w:val="both"/>
+        <w:rPr/>
+      </w:pPr>
+      <w:r>
+        <w:rPr>
+          <w:rFonts w:eastAsia="Times New Roman" w:cs="Times New Roman"/>
+          <w:b/>
+          <w:bCs/>
+          <w:sz w:val="24"/>
+          <w:szCs w:val="24"/>
+        </w:rPr>
+        <w:t xml:space="preserve">Mandatory. </w:t>
+      </w:r>
+      <w:r>
+        <w:rPr>
+          <w:rFonts w:eastAsia="Times New Roman" w:cs="Times New Roman"/>
+          <w:bCs/>
+          <w:sz w:val="24"/>
+          <w:szCs w:val="24"/>
+        </w:rPr>
+        <w:t>Cannot be declined by the player (e.g. T004 mandatory daily deposit ceiling).</w:t>
+      </w:r>
+    </w:p>
+    <w:p>
+      <w:pPr>
+        <w:pStyle w:val="Normal"/>
+        <w:spacing w:lineRule="auto" w:line="240" w:before="0" w:after="120"/>
+        <w:jc w:val="both"/>
+        <w:rPr/>
+      </w:pPr>
+      <w:r>
+        <w:rPr>
+          <w:rFonts w:eastAsia="Times New Roman" w:cs="Times New Roman"/>
+          <w:b/>
+          <w:bCs/>
+          <w:sz w:val="24"/>
+          <w:szCs w:val="24"/>
+        </w:rPr>
+        <w:t xml:space="preserve">Voluntary (opt-in). </w:t>
+      </w:r>
+      <w:r>
+        <w:rPr>
+          <w:rFonts w:eastAsia="Times New Roman" w:cs="Times New Roman"/>
+          <w:bCs/>
+          <w:sz w:val="24"/>
+          <w:szCs w:val="24"/>
+        </w:rPr>
+        <w:t>Requires active player choice to enable (e.g. T001 voluntary daily deposit limit).</w:t>
+      </w:r>
+    </w:p>
+    <w:p>
+      <w:pPr>
+        <w:pStyle w:val="Normal"/>
+        <w:spacing w:lineRule="auto" w:line="240" w:before="0" w:after="120"/>
+        <w:jc w:val="both"/>
+        <w:rPr/>
+      </w:pPr>
+      <w:r>
+        <w:rPr>
+          <w:rFonts w:eastAsia="Times New Roman" w:cs="Times New Roman"/>
+          <w:b/>
+          <w:bCs/>
+          <w:sz w:val="24"/>
+          <w:szCs w:val="24"/>
+        </w:rPr>
+        <w:t xml:space="preserve">Voluntary (opt-out). </w:t>
+      </w:r>
+      <w:r>
+        <w:rPr>
+          <w:rFonts w:eastAsia="Times New Roman" w:cs="Times New Roman"/>
+          <w:bCs/>
+          <w:sz w:val="24"/>
+          <w:szCs w:val="24"/>
+        </w:rPr>
+        <w:t>Enabled by default; requires player choice to disable (e.g. T010 opt-out deposit limit prompt at registration).</w:t>
+      </w:r>
+    </w:p>
+    <w:p>
+      <w:pPr>
+        <w:pStyle w:val="Normal"/>
+        <w:spacing w:lineRule="auto" w:line="240" w:before="0" w:after="120"/>
+        <w:jc w:val="both"/>
+        <w:rPr/>
+      </w:pPr>
+      <w:r>
+        <w:rPr>
+          <w:rFonts w:eastAsia="Times New Roman" w:cs="Times New Roman"/>
+          <w:b/>
+          <w:bCs/>
+          <w:sz w:val="24"/>
+          <w:szCs w:val="24"/>
+        </w:rPr>
+        <w:t xml:space="preserve">Voluntary (self-initiated). </w:t>
+      </w:r>
+      <w:r>
+        <w:rPr>
+          <w:rFonts w:eastAsia="Times New Roman" w:cs="Times New Roman"/>
+          <w:bCs/>
+          <w:sz w:val="24"/>
+          <w:szCs w:val="24"/>
+        </w:rPr>
+        <w:t>Applied by the player independently, without operator infrastructure (e.g. T057 player-installed blocking software).</w:t>
+      </w:r>
+    </w:p>
+    <w:p>
+      <w:pPr>
+        <w:pStyle w:val="Normal"/>
+        <w:spacing w:lineRule="auto" w:line="240" w:before="0" w:after="120"/>
+        <w:jc w:val="both"/>
+        <w:rPr/>
+      </w:pPr>
+      <w:r>
+        <w:rPr>
+          <w:rFonts w:eastAsia="Times New Roman" w:cs="Times New Roman"/>
+          <w:b/>
+          <w:bCs/>
+          <w:sz w:val="24"/>
+          <w:szCs w:val="24"/>
+        </w:rPr>
+        <w:t xml:space="preserve">Hybrid. </w:t>
+      </w:r>
+      <w:r>
+        <w:rPr>
+          <w:rFonts w:eastAsia="Times New Roman" w:cs="Times New Roman"/>
+          <w:bCs/>
+          <w:sz w:val="24"/>
+          <w:szCs w:val="24"/>
+        </w:rPr>
+        <w:t>Combines player-side choice with operator-side enforcement (e.g. T189 third-party petition for a temporary spending freeze).</w:t>
+      </w:r>
+    </w:p>
+    <w:p>
+      <w:pPr>
+        <w:pStyle w:val="Normal"/>
+        <w:spacing w:lineRule="auto" w:line="240" w:before="0" w:after="120"/>
+        <w:jc w:val="both"/>
+        <w:rPr/>
+      </w:pPr>
+      <w:r>
+        <w:rPr>
+          <w:rFonts w:eastAsia="Times New Roman" w:cs="Times New Roman"/>
+          <w:b/>
+          <w:bCs/>
+          <w:sz w:val="24"/>
+          <w:szCs w:val="24"/>
+        </w:rPr>
+        <w:t xml:space="preserve">Operator-side. </w:t>
+      </w:r>
+      <w:r>
+        <w:rPr>
+          <w:rFonts w:eastAsia="Times New Roman" w:cs="Times New Roman"/>
+          <w:bCs/>
+          <w:sz w:val="24"/>
+          <w:szCs w:val="24"/>
+        </w:rPr>
+        <w:t>Operates entirely behind the scenes, with no player-facing control (e.g. T090 rule-based behavioural detection).</w:t>
+      </w:r>
+    </w:p>
+    <w:p>
+      <w:pPr>
+        <w:pStyle w:val="Normal"/>
+        <w:spacing w:lineRule="auto" w:line="240" w:before="160" w:after="100"/>
+        <w:jc w:val="start"/>
+        <w:rPr/>
+      </w:pPr>
+      <w:r>
+        <w:rPr>
+          <w:rFonts w:eastAsia="Times New Roman" w:cs="Times New Roman"/>
+          <w:b/>
+          <w:bCs/>
+          <w:i/>
+          <w:iCs/>
+          <w:sz w:val="24"/>
+          <w:szCs w:val="24"/>
+        </w:rPr>
+        <w:t>Reversibility value definitions</w:t>
+      </w:r>
+    </w:p>
+    <w:p>
+      <w:pPr>
+        <w:pStyle w:val="Normal"/>
+        <w:spacing w:lineRule="auto" w:line="240" w:before="0" w:after="120"/>
+        <w:jc w:val="both"/>
+        <w:rPr/>
+      </w:pPr>
+      <w:r>
+        <w:rPr>
+          <w:rFonts w:eastAsia="Times New Roman" w:cs="Times New Roman"/>
+          <w:b/>
+          <w:bCs/>
+          <w:sz w:val="24"/>
+          <w:szCs w:val="24"/>
+        </w:rPr>
+        <w:t xml:space="preserve">Reversible. </w:t>
+      </w:r>
+      <w:r>
+        <w:rPr>
+          <w:rFonts w:eastAsia="Times New Roman" w:cs="Times New Roman"/>
+          <w:bCs/>
+          <w:sz w:val="24"/>
+          <w:szCs w:val="24"/>
+        </w:rPr>
+        <w:t>The player can undo or modify use of the tool immediately.</w:t>
+      </w:r>
+    </w:p>
+    <w:p>
+      <w:pPr>
+        <w:pStyle w:val="Normal"/>
+        <w:spacing w:lineRule="auto" w:line="240" w:before="0" w:after="120"/>
+        <w:jc w:val="both"/>
+        <w:rPr/>
+      </w:pPr>
+      <w:r>
+        <w:rPr>
+          <w:rFonts w:eastAsia="Times New Roman" w:cs="Times New Roman"/>
+          <w:b/>
+          <w:bCs/>
+          <w:sz w:val="24"/>
+          <w:szCs w:val="24"/>
+        </w:rPr>
+        <w:t xml:space="preserve">Gated. </w:t>
+      </w:r>
+      <w:r>
+        <w:rPr>
+          <w:rFonts w:eastAsia="Times New Roman" w:cs="Times New Roman"/>
+          <w:bCs/>
+          <w:sz w:val="24"/>
+          <w:szCs w:val="24"/>
+        </w:rPr>
+        <w:t>The player can undo or modify use only through a delay or counselling requirement.</w:t>
+      </w:r>
+    </w:p>
+    <w:p>
+      <w:pPr>
+        <w:pStyle w:val="Normal"/>
+        <w:spacing w:lineRule="auto" w:line="240" w:before="0" w:after="120"/>
+        <w:jc w:val="both"/>
+        <w:rPr/>
+      </w:pPr>
+      <w:r>
+        <w:rPr>
+          <w:rFonts w:eastAsia="Times New Roman" w:cs="Times New Roman"/>
+          <w:b/>
+          <w:bCs/>
+          <w:sz w:val="24"/>
+          <w:szCs w:val="24"/>
+        </w:rPr>
+        <w:t xml:space="preserve">Irreversible. </w:t>
+      </w:r>
+      <w:r>
+        <w:rPr>
+          <w:rFonts w:eastAsia="Times New Roman" w:cs="Times New Roman"/>
+          <w:bCs/>
+          <w:sz w:val="24"/>
+          <w:szCs w:val="24"/>
+        </w:rPr>
+        <w:t>Use of the tool cannot be undone; it applies permanently.</w:t>
+      </w:r>
+    </w:p>
+    <w:p>
+      <w:pPr>
+        <w:pStyle w:val="Normal"/>
+        <w:spacing w:lineRule="auto" w:line="240" w:before="0" w:after="120"/>
+        <w:jc w:val="both"/>
+        <w:rPr/>
+      </w:pPr>
+      <w:r>
+        <w:rPr>
+          <w:rFonts w:eastAsia="Times New Roman" w:cs="Times New Roman"/>
+          <w:b/>
+          <w:bCs/>
+          <w:sz w:val="24"/>
+          <w:szCs w:val="24"/>
+        </w:rPr>
+        <w:t xml:space="preserve">N/A. </w:t>
+      </w:r>
+      <w:r>
+        <w:rPr>
+          <w:rFonts w:eastAsia="Times New Roman" w:cs="Times New Roman"/>
+          <w:bCs/>
+          <w:sz w:val="24"/>
+          <w:szCs w:val="24"/>
+        </w:rPr>
+        <w:t>The concept does not apply (e.g. one-time messages, operator-side detection).</w:t>
       </w:r>
     </w:p>
     <w:p>
@@ -4282,7 +4582,7 @@
                 <w:sz w:val="20"/>
                 <w:szCs w:val="20"/>
               </w:rPr>
-              <w:t>User-initiated | Automatic | Operator-initiated | Time-threshold | Spend-threshold | Behaviour-threshold | Event-triggered | Third-party-initiated | N/A</w:t>
+              <w:t>User-initiated | Scheduled | Operator-initiated | Time-threshold | Spend-threshold | Behaviour-threshold | Event-triggered | Third-party-initiated | N/A</w:t>
             </w:r>
           </w:p>
         </w:tc>
@@ -4384,7 +4684,7 @@
                 <w:sz w:val="20"/>
                 <w:szCs w:val="20"/>
               </w:rPr>
-              <w:t>Trigger captures what activates the tool. ‘User-initiated’ tools require active player action. ‘Automatic’ tools activate without any condition (e.g., always-on displays). ‘Operator-initiated’ tools are activated by operator decision (e.g., outreach calls). Threshold-based triggers (‘Time’, ‘Spend’, ‘Behaviour’) activate when the player crosses a defined parameter. ‘Event-triggered’ tools activate on specific events (e.g., wins, deposits). ‘Third-party-initiated’ covers tools triggered by family members or professionals. ‘N/A’ applies where the concept does not meaningfully apply (e.g., always-visible static signage). Stage captures when in the gambling cycle the tool operates.</w:t>
+              <w:t>Trigger captures what activates the tool. ‘User-initiated’ tools require active player action. ‘Scheduled’ tools activate at fixed calendar points (e.g., a weekly account review). ‘Operator-initiated’ tools are activated by operator decision (e.g., outreach calls). Threshold-based triggers (‘Time’, ‘Spend’, ‘Behaviour’) activate when the player crosses a defined parameter. ‘Event-triggered’ tools activate on specific events (e.g., wins, deposits). ‘Third-party-initiated’ covers tools triggered by family members or professionals. ‘N/A’ applies where the concept does not meaningfully apply (e.g., always-visible static signage). Stage captures when in the gambling cycle the tool operates. Compound Trigger values joined by ‘+’ indicate tools activated by more than one condition (e.g. T078 ‘Scheduled + Behaviour-threshold’).</w:t>
             </w:r>
           </w:p>
         </w:tc>
@@ -4393,11 +4693,287 @@
     <w:p>
       <w:pPr>
         <w:pStyle w:val="Normal"/>
-        <w:spacing w:lineRule="auto" w:line="240" w:before="0" w:after="0"/>
-        <w:rPr/>
-      </w:pPr>
-      <w:r>
-        <w:rPr/>
+        <w:spacing w:lineRule="auto" w:line="240" w:before="160" w:after="100"/>
+        <w:jc w:val="start"/>
+        <w:rPr/>
+      </w:pPr>
+      <w:r>
+        <w:rPr>
+          <w:rFonts w:eastAsia="Times New Roman" w:cs="Times New Roman"/>
+          <w:b/>
+          <w:bCs/>
+          <w:i/>
+          <w:iCs/>
+          <w:sz w:val="24"/>
+          <w:szCs w:val="24"/>
+        </w:rPr>
+        <w:t>Stage value definitions</w:t>
+      </w:r>
+    </w:p>
+    <w:p>
+      <w:pPr>
+        <w:pStyle w:val="Normal"/>
+        <w:spacing w:lineRule="auto" w:line="240" w:before="0" w:after="120"/>
+        <w:jc w:val="both"/>
+        <w:rPr/>
+      </w:pPr>
+      <w:r>
+        <w:rPr>
+          <w:rFonts w:eastAsia="Times New Roman" w:cs="Times New Roman"/>
+          <w:b/>
+          <w:bCs/>
+          <w:sz w:val="24"/>
+          <w:szCs w:val="24"/>
+        </w:rPr>
+        <w:t xml:space="preserve">Pre-session. </w:t>
+      </w:r>
+      <w:r>
+        <w:rPr>
+          <w:rFonts w:eastAsia="Times New Roman" w:cs="Times New Roman"/>
+          <w:bCs/>
+          <w:sz w:val="24"/>
+          <w:szCs w:val="24"/>
+        </w:rPr>
+        <w:t>Operates before a gambling session begins, at login, registration or deposit (e.g. T009 deposit limit prompt at registration).</w:t>
+      </w:r>
+    </w:p>
+    <w:p>
+      <w:pPr>
+        <w:pStyle w:val="Normal"/>
+        <w:spacing w:lineRule="auto" w:line="240" w:before="0" w:after="120"/>
+        <w:jc w:val="both"/>
+        <w:rPr/>
+      </w:pPr>
+      <w:r>
+        <w:rPr>
+          <w:rFonts w:eastAsia="Times New Roman" w:cs="Times New Roman"/>
+          <w:b/>
+          <w:bCs/>
+          <w:sz w:val="24"/>
+          <w:szCs w:val="24"/>
+        </w:rPr>
+        <w:t xml:space="preserve">During-play. </w:t>
+      </w:r>
+      <w:r>
+        <w:rPr>
+          <w:rFonts w:eastAsia="Times New Roman" w:cs="Times New Roman"/>
+          <w:bCs/>
+          <w:sz w:val="24"/>
+          <w:szCs w:val="24"/>
+        </w:rPr>
+        <w:t>Operates while the player is actively gambling within a session (e.g. T016 loss-limit progress notification).</w:t>
+      </w:r>
+    </w:p>
+    <w:p>
+      <w:pPr>
+        <w:pStyle w:val="Normal"/>
+        <w:spacing w:lineRule="auto" w:line="240" w:before="0" w:after="120"/>
+        <w:jc w:val="both"/>
+        <w:rPr/>
+      </w:pPr>
+      <w:r>
+        <w:rPr>
+          <w:rFonts w:eastAsia="Times New Roman" w:cs="Times New Roman"/>
+          <w:b/>
+          <w:bCs/>
+          <w:sz w:val="24"/>
+          <w:szCs w:val="24"/>
+        </w:rPr>
+        <w:t xml:space="preserve">Post-session. </w:t>
+      </w:r>
+      <w:r>
+        <w:rPr>
+          <w:rFonts w:eastAsia="Times New Roman" w:cs="Times New Roman"/>
+          <w:bCs/>
+          <w:sz w:val="24"/>
+          <w:szCs w:val="24"/>
+        </w:rPr>
+        <w:t>Operates after a session ends (e.g. T023 residual credits donation).</w:t>
+      </w:r>
+    </w:p>
+    <w:p>
+      <w:pPr>
+        <w:pStyle w:val="Normal"/>
+        <w:spacing w:lineRule="auto" w:line="240" w:before="0" w:after="120"/>
+        <w:jc w:val="both"/>
+        <w:rPr/>
+      </w:pPr>
+      <w:r>
+        <w:rPr>
+          <w:rFonts w:eastAsia="Times New Roman" w:cs="Times New Roman"/>
+          <w:b/>
+          <w:bCs/>
+          <w:sz w:val="24"/>
+          <w:szCs w:val="24"/>
+        </w:rPr>
+        <w:t xml:space="preserve">Between-sessions. </w:t>
+      </w:r>
+      <w:r>
+        <w:rPr>
+          <w:rFonts w:eastAsia="Times New Roman" w:cs="Times New Roman"/>
+          <w:bCs/>
+          <w:sz w:val="24"/>
+          <w:szCs w:val="24"/>
+        </w:rPr>
+        <w:t>Operates between sessions at account level rather than in play (e.g. T052 operator-initiated forced exclusion).</w:t>
+      </w:r>
+    </w:p>
+    <w:p>
+      <w:pPr>
+        <w:pStyle w:val="Normal"/>
+        <w:spacing w:lineRule="auto" w:line="240" w:before="0" w:after="120"/>
+        <w:jc w:val="both"/>
+        <w:rPr/>
+      </w:pPr>
+      <w:r>
+        <w:rPr>
+          <w:rFonts w:eastAsia="Times New Roman" w:cs="Times New Roman"/>
+          <w:b/>
+          <w:bCs/>
+          <w:sz w:val="24"/>
+          <w:szCs w:val="24"/>
+        </w:rPr>
+        <w:t xml:space="preserve">On-demand. </w:t>
+      </w:r>
+      <w:r>
+        <w:rPr>
+          <w:rFonts w:eastAsia="Times New Roman" w:cs="Times New Roman"/>
+          <w:bCs/>
+          <w:sz w:val="24"/>
+          <w:szCs w:val="24"/>
+        </w:rPr>
+        <w:t>Available whenever the player seeks it, at their point of access (e.g. T001 voluntary daily deposit limit).</w:t>
+      </w:r>
+    </w:p>
+    <w:p>
+      <w:pPr>
+        <w:pStyle w:val="Normal"/>
+        <w:spacing w:lineRule="auto" w:line="240" w:before="0" w:after="120"/>
+        <w:jc w:val="both"/>
+        <w:rPr/>
+      </w:pPr>
+      <w:r>
+        <w:rPr>
+          <w:rFonts w:eastAsia="Times New Roman" w:cs="Times New Roman"/>
+          <w:b/>
+          <w:bCs/>
+          <w:sz w:val="24"/>
+          <w:szCs w:val="24"/>
+        </w:rPr>
+        <w:t xml:space="preserve">Continuous. </w:t>
+      </w:r>
+      <w:r>
+        <w:rPr>
+          <w:rFonts w:eastAsia="Times New Roman" w:cs="Times New Roman"/>
+          <w:bCs/>
+          <w:sz w:val="24"/>
+          <w:szCs w:val="24"/>
+        </w:rPr>
+        <w:t>Operates at all times, independent of session boundaries (e.g. T004 mandatory daily deposit ceiling).</w:t>
+      </w:r>
+    </w:p>
+    <w:p>
+      <w:pPr>
+        <w:pStyle w:val="Normal"/>
+        <w:spacing w:lineRule="auto" w:line="240" w:before="0" w:after="120"/>
+        <w:jc w:val="both"/>
+        <w:rPr/>
+      </w:pPr>
+      <w:r>
+        <w:rPr>
+          <w:rFonts w:eastAsia="Times New Roman" w:cs="Times New Roman"/>
+          <w:b/>
+          <w:bCs/>
+          <w:sz w:val="24"/>
+          <w:szCs w:val="24"/>
+        </w:rPr>
+        <w:t xml:space="preserve">Scheduled. </w:t>
+      </w:r>
+      <w:r>
+        <w:rPr>
+          <w:rFonts w:eastAsia="Times New Roman" w:cs="Times New Roman"/>
+          <w:bCs/>
+          <w:sz w:val="24"/>
+          <w:szCs w:val="24"/>
+        </w:rPr>
+        <w:t>Operates at fixed calendar points; no tool carries Scheduled as its sole Stage, and it appears as a Trigger value (see above).</w:t>
+      </w:r>
+    </w:p>
+    <w:p>
+      <w:pPr>
+        <w:pStyle w:val="Normal"/>
+        <w:spacing w:lineRule="auto" w:line="240" w:before="0" w:after="120"/>
+        <w:jc w:val="both"/>
+        <w:rPr/>
+      </w:pPr>
+      <w:r>
+        <w:rPr>
+          <w:rFonts w:eastAsia="Times New Roman" w:cs="Times New Roman"/>
+          <w:b/>
+          <w:bCs/>
+          <w:sz w:val="24"/>
+          <w:szCs w:val="24"/>
+        </w:rPr>
+        <w:t xml:space="preserve">N/A. </w:t>
+      </w:r>
+      <w:r>
+        <w:rPr>
+          <w:rFonts w:eastAsia="Times New Roman" w:cs="Times New Roman"/>
+          <w:bCs/>
+          <w:sz w:val="24"/>
+          <w:szCs w:val="24"/>
+        </w:rPr>
+        <w:t>The concept does not apply.</w:t>
+      </w:r>
+    </w:p>
+    <w:p>
+      <w:pPr>
+        <w:pStyle w:val="Normal"/>
+        <w:spacing w:lineRule="auto" w:line="240" w:before="0" w:after="120"/>
+        <w:jc w:val="both"/>
+        <w:rPr/>
+      </w:pPr>
+      <w:r>
+        <w:rPr>
+          <w:rFonts w:eastAsia="Times New Roman" w:cs="Times New Roman"/>
+          <w:sz w:val="24"/>
+          <w:szCs w:val="24"/>
+        </w:rPr>
+        <w:t>Compound stages joined by ‘+’ mark tools operating at two stages (e.g. T011, T146).</w:t>
+      </w:r>
+    </w:p>
+    <w:p>
+      <w:pPr>
+        <w:pStyle w:val="Normal"/>
+        <w:spacing w:lineRule="auto" w:line="240" w:before="160" w:after="80"/>
+        <w:jc w:val="start"/>
+        <w:rPr/>
+      </w:pPr>
+      <w:r>
+        <w:rPr>
+          <w:rFonts w:eastAsia="Times New Roman" w:cs="Times New Roman"/>
+          <w:b/>
+          <w:bCs/>
+          <w:sz w:val="22"/>
+          <w:szCs w:val="22"/>
+        </w:rPr>
+        <w:t>3.10.1 Stage 1 sources of the specification fields</w:t>
+      </w:r>
+    </w:p>
+    <w:p>
+      <w:pPr>
+        <w:pStyle w:val="Normal"/>
+        <w:spacing w:lineRule="auto" w:line="240" w:before="0" w:after="120"/>
+        <w:jc w:val="both"/>
+        <w:rPr/>
+      </w:pPr>
+      <w:r>
+        <w:rPr>
+          <w:rFonts w:eastAsia="Times New Roman" w:cs="Times New Roman"/>
+          <w:sz w:val="24"/>
+          <w:szCs w:val="24"/>
+        </w:rPr>
+        <w:t>The five specification fields consolidate record-level information from the Stage 1 extraction (fields as named in 02.1 Field Inventory and 02.2 Extraction Codebook; stored columns in brackets). Target Population consolidates Tool_Target_Tier (section 3.6). Delivery Context consolidates Setting (Platform_Setting) for Channel and Modality (a sub-field of Delivery_Mechanism) for Delivery. Personalisation consolidates Personalisation (a sub-field of User_Interaction): NONE maps to Non-tailored, USER-SET to User-tailored, BEHAVIOURAL to System-tailored, INDIVIDUALISED to Practitioner-tailored, with compound Stage 2 values where linked records carried more than one mode. Trigger consolidates Trigger and Timing (sub-fields of Delivery_Mechanism) for the Trigger and Stage components respectively. Governance consolidates Control (a sub-field of User_Interaction) for the Control component; the Reversibility component was introduced at Stage 2 and has no Stage 1 equivalent, being coded from the tool description and the linked records’ implementation detail. In each case the Stage 1 values of the records listed in Taxonomy Source were read together and resolved to a single framework-level value under the decision rules of sections 3.6 to 3.10; where records disagreed, the value describing the tool as specified in the Framework (its mechanism and parameters) took precedence over the value describing a particular study’s implementation.</w:t>
       </w:r>
     </w:p>
     <w:p>
@@ -4636,7 +5212,7 @@
                 <w:sz w:val="20"/>
                 <w:szCs w:val="20"/>
               </w:rPr>
-              <w:t>Assigned by reference to the tool’s Taxonomy Source. Tools with one or more substantive empirical traces are coded as Empirically tested. Tools with no empirical traces but conceptual grounding in the reviewed evidence are Theoretically derived. Tools that exist as regulatory or structural features (typically without RCT-level evaluation) are Policy / structural. Tools added by mechanistic extrapolation from the reviewed evidence base are Extrapolated.</w:t>
+              <w:t>Assigned by reference to the tool’s Taxonomy Source. Tools with one or more substantive empirical traces are coded as Empirically tested. Tools with no empirical traces but conceptual grounding in the reviewed evidence are Theoretically derived. Tools that are primarily regulatory or structural features (typically documented without direct empirical evaluation of their effect) are Policy / structural. Tools added by mechanistic extrapolation from the reviewed evidence base are Extrapolated.</w:t>
             </w:r>
           </w:p>
         </w:tc>
@@ -4747,7 +5323,7 @@
           <w:sz w:val="24"/>
           <w:szCs w:val="24"/>
         </w:rPr>
-        <w:t>The tool is a regulatory or structural feature; it is documented in the literature but typically without RCT-level evaluation. Used for policy-mandated controls (regulatory caps, mandatory signage, structural EGM modifications).</w:t>
+        <w:t>The tool is primarily a regulatory or structural feature; it is documented in the literature, typically without direct empirical evaluation of its effect. Used for policy-mandated controls (regulatory caps, mandatory signage, structural EGM modifications).</w:t>
       </w:r>
     </w:p>
     <w:p>
@@ -4999,7 +5575,7 @@
                 <w:sz w:val="20"/>
                 <w:szCs w:val="20"/>
               </w:rPr>
-              <w:t>Populated according to the substantive trace rule (described below). All 410 Stage 1 records are referenced at least once across the column; conversely, 169 of 210 tools have at least one trace, with the remaining 41 tools (extrapolated and proposed) having no trace.</w:t>
+              <w:t>Populated according to the substantive trace rule (described below). All 410 Stage 1 records are referenced at least once across the column; conversely, 169 of 210 tools have at least one trace, with the remaining 41 tools (34 Extrapolated, 6 Theoretically derived, 1 Policy / structural) having no trace.</w:t>
             </w:r>
           </w:p>
         </w:tc>
@@ -5296,7 +5872,7 @@
           <w:sz w:val="24"/>
           <w:szCs w:val="24"/>
         </w:rPr>
-        <w:t>Stage 1 categorised tool records by their primary tool code. Framework tool boundaries cut across Stage 1 codes for a substantial share of traces, so some studies are filed under one code in Stage 1 but substantively examine a Framework tool in a different code. Of the 602 traces recorded in the Taxonomy Source column, 117 (19.4%) link a record to a Framework tool whose Category differs from every component of the record’s Stage 1 tool code, and 93 (15.4%) link it to a Framework tool in a different Domain from the one the record was filed under (Cross_Category_Drift analysis; the broader any-difference count, which also includes compound Stage 1 codes decomposed to a single Framework Category, is 191, 31.7%). Examples:</w:t>
+        <w:t>Stage 1 categorised tool records by their primary tool code. Framework tool boundaries cut across Stage 1 codes for a substantial share of traces, so some studies are filed under one code in Stage 1 but substantively examine a Framework tool in a different code. Of the 602 traces recorded in the Taxonomy Source column, 117 (19.4%) link a record to a Framework tool whose Category differs from every component of the record’s Stage 1 tool code, and 85 (14.1%) link it to a Framework tool whose framework domain differs from the domain the record was filed under at Stage 1 (record side: the taxonomy domain of the record’s first-listed Stage 1 code, with time-based limits and mandatory breaks read as Time and Session Management, as in the main manuscript; framework side: the domain of the Framework tool’s Tool Code in the Tool Code Reference sheet, so that placement in the Extrapolated and Novel Tools domain, or by mechanism as for T041 and T042, does not count as a crossing) (Cross_Category_Drift analysis; the broader any-difference count, which also includes compound Stage 1 codes decomposed to a single Framework Category, is 191, 31.7%). Examples:</w:t>
       </w:r>
     </w:p>
     <w:p>
@@ -6395,6 +6971,22 @@
           <w:szCs w:val="24"/>
         </w:rPr>
         <w:t xml:space="preserve">Codebook revision 1.1 (September 2026): Section 3.12.3 revised to report the cross-code and cross-domain trace counts (117 of 602 and 93 of 602) in place of the earlier description of drift as occasional. The Framework file (04.1), Tool IDs, and controlled vocabularies are unchanged.</w:t>
+      </w:r>
+    </w:p>
+    <w:p>
+      <w:pPr>
+        <w:pStyle w:val="Normal"/>
+        <w:spacing w:lineRule="auto" w:line="240" w:before="0" w:after="120"/>
+        <w:jc w:val="both"/>
+        <w:rPr/>
+      </w:pPr>
+      <w:r>
+        <w:rPr>
+          <w:rFonts w:eastAsia="Times New Roman" w:cs="Times New Roman"/>
+          <w:sz w:val="24"/>
+          <w:szCs w:val="24"/>
+        </w:rPr>
+        <w:t>Codebook revision 1.2 (September 2026): Target Population decision rule (section 3.6) restated as design intent with Stage 1 Tool_Target_Tier as the third criterion, and its note corrected (LOW to Universal; Moderate-High-risk introduced at Stage 2); Stage 1 sources of all five specification fields documented (new section 3.10.1); T200 and T207 described as newly designed tools later linked to Stage 1 records (sections 2.1 and 3.2); domain rule extended for tools whose framework domain differs from the domain of their tool code (section 3.2); Governance and Stage value definitions added (sections 3.8 and 3.10); Trigger vocabulary corrected to the values used in the Framework file (Scheduled in, Automatic out; compound values noted); Policy / structural definition aligned with the main manuscript (section 3.11); cross-domain trace count corrected to 85 of 602 after removal of a duplicate trace token in T076 and recounting as crossings of framework domains, with the counting convention stated (section 3.12.3). The Framework file (04.1) changes only by the removal of that duplicate token and a spelling harmonisation; Tool IDs and all other cell values are unchanged.</w:t>
       </w:r>
     </w:p>
     <w:p>

</xml_diff>